<commit_message>
Filled in data in tables in the report
</commit_message>
<xml_diff>
--- a/4EB00Special Topic Jet Engine Report Template 2026.docx
+++ b/4EB00Special Topic Jet Engine Report Template 2026.docx
@@ -1,6 +1,6 @@
 
 <file path=word/document.xml><?xml version="1.0" encoding="utf-8"?>
-<w:document xmlns:wpc="http://schemas.microsoft.com/office/word/2010/wordprocessingCanvas" xmlns:cx="http://schemas.microsoft.com/office/drawing/2014/chartex" xmlns:cx1="http://schemas.microsoft.com/office/drawing/2015/9/8/chartex" xmlns:cx2="http://schemas.microsoft.com/office/drawing/2015/10/21/chartex" xmlns:cx3="http://schemas.microsoft.com/office/drawing/2016/5/9/chartex" xmlns:cx4="http://schemas.microsoft.com/office/drawing/2016/5/10/chartex" xmlns:cx5="http://schemas.microsoft.com/office/drawing/2016/5/11/chartex" xmlns:cx6="http://schemas.microsoft.com/office/drawing/2016/5/12/chartex" xmlns:cx7="http://schemas.microsoft.com/office/drawing/2016/5/13/chartex" xmlns:cx8="http://schemas.microsoft.com/office/drawing/2016/5/14/chartex" xmlns:mc="http://schemas.openxmlformats.org/markup-compatibility/2006" xmlns:m="http://schemas.openxmlformats.org/officeDocument/2006/math" xmlns:aink="http://schemas.microsoft.com/office/drawing/2016/ink" xmlns:am3d="http://schemas.microsoft.com/office/drawing/2017/model3d" xmlns:oel="http://schemas.microsoft.com/office/2019/extlst" xmlns:r="http://schemas.openxmlformats.org/officeDocument/2006/relationships" xmlns:wp14="http://schemas.microsoft.com/office/word/2010/wordprocessingDrawing" xmlns:wp="http://schemas.openxmlformats.org/drawingml/2006/wordprocessingDrawing" xmlns:wpg="http://schemas.microsoft.com/office/word/2010/wordprocessingGroup" xmlns:wpi="http://schemas.microsoft.com/office/word/2010/wordprocessingInk" xmlns:wps="http://schemas.microsoft.com/office/word/2010/wordprocessingShape" xmlns:o="urn:schemas-microsoft-com:office:office" xmlns:v="urn:schemas-microsoft-com:vml" xmlns:w10="urn:schemas-microsoft-com:office:word" xmlns:w="http://schemas.openxmlformats.org/wordprocessingml/2006/main" xmlns:w14="http://schemas.microsoft.com/office/word/2010/wordml" xmlns:w15="http://schemas.microsoft.com/office/word/2012/wordml" xmlns:w16cex="http://schemas.microsoft.com/office/word/2018/wordml/cex" xmlns:w16cid="http://schemas.microsoft.com/office/word/2016/wordml/cid" xmlns:w16="http://schemas.microsoft.com/office/word/2018/wordml" xmlns:w16sdtdh="http://schemas.microsoft.com/office/word/2020/wordml/sdtdatahash" xmlns:w16sdtfl="http://schemas.microsoft.com/office/word/2024/wordml/sdtformatlock" xmlns:w16se="http://schemas.microsoft.com/office/word/2015/wordml/symex" xmlns:w16du="http://schemas.microsoft.com/office/word/2023/wordml/word16du" xmlns:wne="http://schemas.microsoft.com/office/word/2006/wordml" mc:Ignorable="w14 w15 w16se w16cid w16 w16cex w16sdtdh w16sdtfl w16du wp14">
+<w:document xmlns:wpc="http://schemas.microsoft.com/office/word/2010/wordprocessingCanvas" xmlns:cx="http://schemas.microsoft.com/office/drawing/2014/chartex" xmlns:cx1="http://schemas.microsoft.com/office/drawing/2015/9/8/chartex" xmlns:cx2="http://schemas.microsoft.com/office/drawing/2015/10/21/chartex" xmlns:cx3="http://schemas.microsoft.com/office/drawing/2016/5/9/chartex" xmlns:cx4="http://schemas.microsoft.com/office/drawing/2016/5/10/chartex" xmlns:cx5="http://schemas.microsoft.com/office/drawing/2016/5/11/chartex" xmlns:cx6="http://schemas.microsoft.com/office/drawing/2016/5/12/chartex" xmlns:cx7="http://schemas.microsoft.com/office/drawing/2016/5/13/chartex" xmlns:cx8="http://schemas.microsoft.com/office/drawing/2016/5/14/chartex" xmlns:mc="http://schemas.openxmlformats.org/markup-compatibility/2006" xmlns:aink="http://schemas.microsoft.com/office/drawing/2016/ink" xmlns:am3d="http://schemas.microsoft.com/office/drawing/2017/model3d" xmlns:o="urn:schemas-microsoft-com:office:office" xmlns:oel="http://schemas.microsoft.com/office/2019/extlst" xmlns:r="http://schemas.openxmlformats.org/officeDocument/2006/relationships" xmlns:m="http://schemas.openxmlformats.org/officeDocument/2006/math" xmlns:v="urn:schemas-microsoft-com:vml" xmlns:wp14="http://schemas.microsoft.com/office/word/2010/wordprocessingDrawing" xmlns:wp="http://schemas.openxmlformats.org/drawingml/2006/wordprocessingDrawing" xmlns:w10="urn:schemas-microsoft-com:office:word" xmlns:w="http://schemas.openxmlformats.org/wordprocessingml/2006/main" xmlns:w14="http://schemas.microsoft.com/office/word/2010/wordml" xmlns:w15="http://schemas.microsoft.com/office/word/2012/wordml" xmlns:w16cex="http://schemas.microsoft.com/office/word/2018/wordml/cex" xmlns:w16cid="http://schemas.microsoft.com/office/word/2016/wordml/cid" xmlns:w16="http://schemas.microsoft.com/office/word/2018/wordml" xmlns:w16du="http://schemas.microsoft.com/office/word/2023/wordml/word16du" xmlns:w16sdtdh="http://schemas.microsoft.com/office/word/2020/wordml/sdtdatahash" xmlns:w16sdtfl="http://schemas.microsoft.com/office/word/2024/wordml/sdtformatlock" xmlns:w16se="http://schemas.microsoft.com/office/word/2015/wordml/symex" xmlns:wpg="http://schemas.microsoft.com/office/word/2010/wordprocessingGroup" xmlns:wpi="http://schemas.microsoft.com/office/word/2010/wordprocessingInk" xmlns:wne="http://schemas.microsoft.com/office/word/2006/wordml" xmlns:wps="http://schemas.microsoft.com/office/word/2010/wordprocessingShape" mc:Ignorable="w14 w15 w16se w16cid w16 w16cex w16sdtdh w16sdtfl w16du wp14">
   <w:body>
     <w:p>
       <w:pPr>
@@ -132,6 +132,7 @@
                 <w:color w:val="C00000"/>
               </w:rPr>
             </w:pPr>
+            <w:proofErr w:type="spellStart"/>
             <w:r>
               <w:rPr>
                 <w:b/>
@@ -139,6 +140,7 @@
               </w:rPr>
               <w:t>Studentnr</w:t>
             </w:r>
+            <w:proofErr w:type="spellEnd"/>
           </w:p>
         </w:tc>
       </w:tr>
@@ -181,6 +183,22 @@
                 <w:color w:val="C00000"/>
               </w:rPr>
             </w:pPr>
+            <w:r>
+              <w:rPr>
+                <w:b/>
+                <w:color w:val="C00000"/>
+              </w:rPr>
+              <w:t xml:space="preserve">Alexander </w:t>
+            </w:r>
+            <w:proofErr w:type="spellStart"/>
+            <w:r>
+              <w:rPr>
+                <w:b/>
+                <w:color w:val="C00000"/>
+              </w:rPr>
+              <w:t>Gukasyan</w:t>
+            </w:r>
+            <w:proofErr w:type="spellEnd"/>
           </w:p>
         </w:tc>
         <w:tc>
@@ -235,6 +253,31 @@
                 <w:color w:val="C00000"/>
               </w:rPr>
             </w:pPr>
+            <w:proofErr w:type="spellStart"/>
+            <w:r>
+              <w:rPr>
+                <w:b/>
+                <w:color w:val="C00000"/>
+              </w:rPr>
+              <w:t>Mihails</w:t>
+            </w:r>
+            <w:proofErr w:type="spellEnd"/>
+            <w:r>
+              <w:rPr>
+                <w:b/>
+                <w:color w:val="C00000"/>
+              </w:rPr>
+              <w:t xml:space="preserve"> </w:t>
+            </w:r>
+            <w:proofErr w:type="spellStart"/>
+            <w:r>
+              <w:rPr>
+                <w:b/>
+                <w:color w:val="C00000"/>
+              </w:rPr>
+              <w:t>Saruls</w:t>
+            </w:r>
+            <w:proofErr w:type="spellEnd"/>
           </w:p>
         </w:tc>
         <w:tc>
@@ -289,6 +332,22 @@
                 <w:color w:val="C00000"/>
               </w:rPr>
             </w:pPr>
+            <w:r>
+              <w:rPr>
+                <w:b/>
+                <w:color w:val="C00000"/>
+              </w:rPr>
+              <w:t xml:space="preserve">Olegs </w:t>
+            </w:r>
+            <w:proofErr w:type="spellStart"/>
+            <w:r>
+              <w:rPr>
+                <w:b/>
+                <w:color w:val="C00000"/>
+              </w:rPr>
+              <w:t>Panferovs</w:t>
+            </w:r>
+            <w:proofErr w:type="spellEnd"/>
           </w:p>
         </w:tc>
         <w:tc>
@@ -343,6 +402,22 @@
                 <w:color w:val="C00000"/>
               </w:rPr>
             </w:pPr>
+            <w:proofErr w:type="spellStart"/>
+            <w:r>
+              <w:rPr>
+                <w:b/>
+                <w:color w:val="C00000"/>
+              </w:rPr>
+              <w:t>Jegors</w:t>
+            </w:r>
+            <w:proofErr w:type="spellEnd"/>
+            <w:r>
+              <w:rPr>
+                <w:b/>
+                <w:color w:val="C00000"/>
+              </w:rPr>
+              <w:t xml:space="preserve"> Karpovs</w:t>
+            </w:r>
           </w:p>
         </w:tc>
         <w:tc>
@@ -358,6 +433,13 @@
                 <w:color w:val="C00000"/>
               </w:rPr>
             </w:pPr>
+            <w:r>
+              <w:rPr>
+                <w:b/>
+                <w:color w:val="C00000"/>
+              </w:rPr>
+              <w:t>2259176</w:t>
+            </w:r>
           </w:p>
         </w:tc>
       </w:tr>
@@ -382,16 +464,16 @@
         <mc:AlternateContent>
           <mc:Choice Requires="wps">
             <w:drawing>
-              <wp:anchor distT="0" distB="0" distL="114300" distR="114300" simplePos="0" relativeHeight="251659264" behindDoc="0" locked="0" layoutInCell="1" allowOverlap="1" wp14:anchorId="060031CF" wp14:editId="5083951C">
+              <wp:anchor distT="0" distB="0" distL="114300" distR="114300" simplePos="0" relativeHeight="251659264" behindDoc="0" locked="0" layoutInCell="1" allowOverlap="1" wp14:anchorId="060031CF" wp14:editId="292074A7">
                 <wp:simplePos x="0" y="0"/>
                 <wp:positionH relativeFrom="column">
-                  <wp:posOffset>828675</wp:posOffset>
+                  <wp:posOffset>826770</wp:posOffset>
                 </wp:positionH>
                 <wp:positionV relativeFrom="paragraph">
-                  <wp:posOffset>67310</wp:posOffset>
+                  <wp:posOffset>65405</wp:posOffset>
                 </wp:positionV>
-                <wp:extent cx="657225" cy="552450"/>
-                <wp:effectExtent l="19050" t="19050" r="19050" b="19050"/>
+                <wp:extent cx="765810" cy="552450"/>
+                <wp:effectExtent l="19050" t="19050" r="15240" b="19050"/>
                 <wp:wrapNone/>
                 <wp:docPr id="1" name="Rectangle 6"/>
                 <wp:cNvGraphicFramePr>
@@ -406,7 +488,7 @@
                       <wps:spPr bwMode="auto">
                         <a:xfrm>
                           <a:off x="0" y="0"/>
-                          <a:ext cx="657225" cy="552450"/>
+                          <a:ext cx="765810" cy="552450"/>
                         </a:xfrm>
                         <a:prstGeom prst="rect">
                           <a:avLst/>
@@ -431,14 +513,16 @@
                               <w:rPr>
                                 <w:color w:val="C00000"/>
                                 <w:sz w:val="56"/>
+                                <w:lang w:val="en-GB"/>
                               </w:rPr>
                             </w:pPr>
                             <w:r>
                               <w:rPr>
                                 <w:color w:val="C00000"/>
                                 <w:sz w:val="56"/>
+                                <w:lang w:val="en-GB"/>
                               </w:rPr>
-                              <w:t>?</w:t>
+                              <w:t>152</w:t>
                             </w:r>
                           </w:p>
                         </w:txbxContent>
@@ -460,7 +544,7 @@
           </mc:Choice>
           <mc:Fallback>
             <w:pict>
-              <v:rect id="Rectangle 6" o:spid="_x0000_s1026" style="position:absolute;left:0;text-align:left;margin-left:65.25pt;margin-top:5.3pt;width:51.75pt;height:43.5pt;z-index:251659264;visibility:visible;mso-wrap-style:square;mso-width-percent:0;mso-height-percent:0;mso-wrap-distance-left:9pt;mso-wrap-distance-top:0;mso-wrap-distance-right:9pt;mso-wrap-distance-bottom:0;mso-position-horizontal:absolute;mso-position-horizontal-relative:text;mso-position-vertical:absolute;mso-position-vertical-relative:text;mso-width-percent:0;mso-height-percent:0;mso-width-relative:page;mso-height-relative:page;v-text-anchor:top" o:gfxdata="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" strokecolor="#c00000" strokeweight="2.25pt">
+              <v:rect w14:anchorId="060031CF" id="Rectangle 6" o:spid="_x0000_s1026" style="position:absolute;left:0;text-align:left;margin-left:65.1pt;margin-top:5.15pt;width:60.3pt;height:43.5pt;z-index:251659264;visibility:visible;mso-wrap-style:square;mso-width-percent:0;mso-height-percent:0;mso-wrap-distance-left:9pt;mso-wrap-distance-top:0;mso-wrap-distance-right:9pt;mso-wrap-distance-bottom:0;mso-position-horizontal:absolute;mso-position-horizontal-relative:text;mso-position-vertical:absolute;mso-position-vertical-relative:text;mso-width-percent:0;mso-height-percent:0;mso-width-relative:page;mso-height-relative:page;v-text-anchor:top" o:gfxdata="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" strokecolor="#c00000" strokeweight="2.25pt">
                 <v:textbox>
                   <w:txbxContent>
                     <w:p>
@@ -469,14 +553,16 @@
                         <w:rPr>
                           <w:color w:val="C00000"/>
                           <w:sz w:val="56"/>
+                          <w:lang w:val="en-GB"/>
                         </w:rPr>
                       </w:pPr>
                       <w:r>
                         <w:rPr>
                           <w:color w:val="C00000"/>
                           <w:sz w:val="56"/>
+                          <w:lang w:val="en-GB"/>
                         </w:rPr>
-                        <w:t>?</w:t>
+                        <w:t>152</w:t>
                       </w:r>
                     </w:p>
                   </w:txbxContent>
@@ -668,6 +754,7 @@
                 <w:sz w:val="24"/>
               </w:rPr>
             </w:pPr>
+            <w:proofErr w:type="spellStart"/>
             <w:r>
               <w:rPr>
                 <w:b/>
@@ -676,6 +763,7 @@
               </w:rPr>
               <w:t>Fuel</w:t>
             </w:r>
+            <w:proofErr w:type="spellEnd"/>
           </w:p>
         </w:tc>
         <w:tc>
@@ -690,6 +778,14 @@
                 <w:sz w:val="24"/>
               </w:rPr>
             </w:pPr>
+            <w:r>
+              <w:rPr>
+                <w:b/>
+                <w:color w:val="C00000"/>
+                <w:sz w:val="24"/>
+              </w:rPr>
+              <w:t>CH4</w:t>
+            </w:r>
           </w:p>
         </w:tc>
         <w:tc>
@@ -722,6 +818,7 @@
                 <w:sz w:val="24"/>
               </w:rPr>
             </w:pPr>
+            <w:proofErr w:type="spellStart"/>
             <w:r>
               <w:rPr>
                 <w:b/>
@@ -730,6 +827,7 @@
               </w:rPr>
               <w:t>Tamb</w:t>
             </w:r>
+            <w:proofErr w:type="spellEnd"/>
           </w:p>
         </w:tc>
         <w:tc>
@@ -744,6 +842,14 @@
                 <w:sz w:val="24"/>
               </w:rPr>
             </w:pPr>
+            <w:r>
+              <w:rPr>
+                <w:b/>
+                <w:color w:val="C00000"/>
+                <w:sz w:val="24"/>
+              </w:rPr>
+              <w:t>250.00</w:t>
+            </w:r>
           </w:p>
         </w:tc>
         <w:tc>
@@ -806,6 +912,14 @@
                 <w:sz w:val="24"/>
               </w:rPr>
             </w:pPr>
+            <w:r>
+              <w:rPr>
+                <w:b/>
+                <w:color w:val="C00000"/>
+                <w:sz w:val="24"/>
+              </w:rPr>
+              <w:t>7.00</w:t>
+            </w:r>
           </w:p>
         </w:tc>
         <w:tc>
@@ -846,6 +960,7 @@
                 <w:sz w:val="24"/>
               </w:rPr>
             </w:pPr>
+            <w:proofErr w:type="spellStart"/>
             <w:r>
               <w:rPr>
                 <w:b/>
@@ -854,6 +969,7 @@
               </w:rPr>
               <w:t>Pamb</w:t>
             </w:r>
+            <w:proofErr w:type="spellEnd"/>
           </w:p>
         </w:tc>
         <w:tc>
@@ -868,6 +984,14 @@
                 <w:sz w:val="24"/>
               </w:rPr>
             </w:pPr>
+            <w:r>
+              <w:rPr>
+                <w:b/>
+                <w:color w:val="C00000"/>
+                <w:sz w:val="24"/>
+              </w:rPr>
+              <w:t>55000.00</w:t>
+            </w:r>
           </w:p>
         </w:tc>
         <w:tc>
@@ -908,6 +1032,8 @@
                 <w:sz w:val="24"/>
               </w:rPr>
             </w:pPr>
+            <w:proofErr w:type="spellStart"/>
+            <w:proofErr w:type="gramStart"/>
             <w:r>
               <w:rPr>
                 <w:b/>
@@ -916,6 +1042,8 @@
               </w:rPr>
               <w:t>mfurate</w:t>
             </w:r>
+            <w:proofErr w:type="spellEnd"/>
+            <w:proofErr w:type="gramEnd"/>
           </w:p>
         </w:tc>
         <w:tc>
@@ -930,6 +1058,14 @@
                 <w:sz w:val="24"/>
               </w:rPr>
             </w:pPr>
+            <w:r>
+              <w:rPr>
+                <w:b/>
+                <w:color w:val="C00000"/>
+                <w:sz w:val="24"/>
+              </w:rPr>
+              <w:t>0.68</w:t>
+            </w:r>
           </w:p>
         </w:tc>
         <w:tc>
@@ -950,7 +1086,25 @@
                 <w:color w:val="C00000"/>
                 <w:sz w:val="24"/>
               </w:rPr>
-              <w:t>[kg/s]</w:t>
+              <w:t>[</w:t>
+            </w:r>
+            <w:proofErr w:type="gramStart"/>
+            <w:r>
+              <w:rPr>
+                <w:b/>
+                <w:color w:val="C00000"/>
+                <w:sz w:val="24"/>
+              </w:rPr>
+              <w:t>kg</w:t>
+            </w:r>
+            <w:proofErr w:type="gramEnd"/>
+            <w:r>
+              <w:rPr>
+                <w:b/>
+                <w:color w:val="C00000"/>
+                <w:sz w:val="24"/>
+              </w:rPr>
+              <w:t>/s]</w:t>
             </w:r>
           </w:p>
         </w:tc>
@@ -992,6 +1146,14 @@
                 <w:sz w:val="24"/>
               </w:rPr>
             </w:pPr>
+            <w:r>
+              <w:rPr>
+                <w:b/>
+                <w:color w:val="C00000"/>
+                <w:sz w:val="24"/>
+              </w:rPr>
+              <w:t>102.78</w:t>
+            </w:r>
           </w:p>
         </w:tc>
         <w:tc>
@@ -1012,7 +1174,25 @@
                 <w:color w:val="C00000"/>
                 <w:sz w:val="24"/>
               </w:rPr>
-              <w:t>[kg/kg]</w:t>
+              <w:t>[</w:t>
+            </w:r>
+            <w:proofErr w:type="gramStart"/>
+            <w:r>
+              <w:rPr>
+                <w:b/>
+                <w:color w:val="C00000"/>
+                <w:sz w:val="24"/>
+              </w:rPr>
+              <w:t>kg</w:t>
+            </w:r>
+            <w:proofErr w:type="gramEnd"/>
+            <w:r>
+              <w:rPr>
+                <w:b/>
+                <w:color w:val="C00000"/>
+                <w:sz w:val="24"/>
+              </w:rPr>
+              <w:t>/kg]</w:t>
             </w:r>
           </w:p>
         </w:tc>
@@ -1032,13 +1212,23 @@
                 <w:sz w:val="24"/>
               </w:rPr>
             </w:pPr>
+            <w:proofErr w:type="gramStart"/>
             <w:r>
               <w:rPr>
                 <w:b/>
                 <w:color w:val="C00000"/>
                 <w:sz w:val="24"/>
               </w:rPr>
-              <w:t>v1</w:t>
+              <w:t>v</w:t>
+            </w:r>
+            <w:proofErr w:type="gramEnd"/>
+            <w:r>
+              <w:rPr>
+                <w:b/>
+                <w:color w:val="C00000"/>
+                <w:sz w:val="24"/>
+              </w:rPr>
+              <w:t>1</w:t>
             </w:r>
           </w:p>
         </w:tc>
@@ -1052,8 +1242,18 @@
                 <w:b/>
                 <w:color w:val="C00000"/>
                 <w:sz w:val="24"/>
-              </w:rPr>
-            </w:pPr>
+                <w:lang w:val="en-NL"/>
+              </w:rPr>
+            </w:pPr>
+            <w:r>
+              <w:rPr>
+                <w:b/>
+                <w:color w:val="C00000"/>
+                <w:sz w:val="24"/>
+                <w:lang w:val="en-NL"/>
+              </w:rPr>
+              <w:t>200</w:t>
+            </w:r>
           </w:p>
         </w:tc>
         <w:tc>
@@ -1074,7 +1274,25 @@
                 <w:color w:val="C00000"/>
                 <w:sz w:val="24"/>
               </w:rPr>
-              <w:t>[m/s]</w:t>
+              <w:t>[</w:t>
+            </w:r>
+            <w:proofErr w:type="gramStart"/>
+            <w:r>
+              <w:rPr>
+                <w:b/>
+                <w:color w:val="C00000"/>
+                <w:sz w:val="24"/>
+              </w:rPr>
+              <w:t>m</w:t>
+            </w:r>
+            <w:proofErr w:type="gramEnd"/>
+            <w:r>
+              <w:rPr>
+                <w:b/>
+                <w:color w:val="C00000"/>
+                <w:sz w:val="24"/>
+              </w:rPr>
+              <w:t>/s]</w:t>
             </w:r>
           </w:p>
         </w:tc>
@@ -1268,7 +1486,21 @@
         <w:rPr>
           <w:lang w:val="en-US"/>
         </w:rPr>
-        <w:t xml:space="preserve"> tables fill out table 1. The code and approach should be explained in detail in the following pages. As an example a worked-out part </w:t>
+        <w:t xml:space="preserve"> tables fill out table 1. The code and approach should be explained in detail in the following pages. As an </w:t>
+      </w:r>
+      <w:proofErr w:type="gramStart"/>
+      <w:r>
+        <w:rPr>
+          <w:lang w:val="en-US"/>
+        </w:rPr>
+        <w:t>example</w:t>
+      </w:r>
+      <w:proofErr w:type="gramEnd"/>
+      <w:r>
+        <w:rPr>
+          <w:lang w:val="en-US"/>
+        </w:rPr>
+        <w:t xml:space="preserve"> a worked-out part </w:t>
       </w:r>
       <w:r>
         <w:rPr>
@@ -1500,6 +1732,12 @@
                 <w:lang w:val="en-US"/>
               </w:rPr>
             </w:pPr>
+            <w:r>
+              <w:rPr>
+                <w:lang w:val="en-NL"/>
+              </w:rPr>
+              <w:t xml:space="preserve">55.00      </w:t>
+            </w:r>
           </w:p>
         </w:tc>
         <w:tc>
@@ -1514,6 +1752,12 @@
                 <w:lang w:val="en-US"/>
               </w:rPr>
             </w:pPr>
+            <w:r>
+              <w:rPr>
+                <w:lang w:val="en-NL"/>
+              </w:rPr>
+              <w:t xml:space="preserve">71.84     </w:t>
+            </w:r>
           </w:p>
         </w:tc>
         <w:tc>
@@ -1528,6 +1772,12 @@
                 <w:lang w:val="en-US"/>
               </w:rPr>
             </w:pPr>
+            <w:r>
+              <w:rPr>
+                <w:lang w:val="en-NL"/>
+              </w:rPr>
+              <w:t xml:space="preserve">502.89     </w:t>
+            </w:r>
           </w:p>
         </w:tc>
         <w:tc>
@@ -1542,6 +1792,12 @@
                 <w:lang w:val="en-US"/>
               </w:rPr>
             </w:pPr>
+            <w:r>
+              <w:rPr>
+                <w:lang w:val="en-NL"/>
+              </w:rPr>
+              <w:t xml:space="preserve">502.89     </w:t>
+            </w:r>
           </w:p>
         </w:tc>
         <w:tc>
@@ -1553,9 +1809,15 @@
               <w:pStyle w:val="NoSpacing"/>
               <w:jc w:val="both"/>
               <w:rPr>
-                <w:lang w:val="en-US"/>
-              </w:rPr>
-            </w:pPr>
+                <w:lang w:val="en-NL"/>
+              </w:rPr>
+            </w:pPr>
+            <w:r>
+              <w:rPr>
+                <w:lang w:val="en-NL"/>
+              </w:rPr>
+              <w:t xml:space="preserve">215.55      </w:t>
+            </w:r>
           </w:p>
         </w:tc>
         <w:tc>
@@ -1570,6 +1832,12 @@
                 <w:lang w:val="en-US"/>
               </w:rPr>
             </w:pPr>
+            <w:r>
+              <w:rPr>
+                <w:lang w:val="en-NL"/>
+              </w:rPr>
+              <w:t>55.00</w:t>
+            </w:r>
           </w:p>
         </w:tc>
       </w:tr>
@@ -1598,6 +1866,9 @@
               <w:pStyle w:val="NoSpacing"/>
               <w:jc w:val="both"/>
             </w:pPr>
+            <w:r>
+              <w:t xml:space="preserve">250.00     </w:t>
+            </w:r>
           </w:p>
         </w:tc>
         <w:tc>
@@ -1609,6 +1880,9 @@
               <w:pStyle w:val="NoSpacing"/>
               <w:jc w:val="both"/>
             </w:pPr>
+            <w:r>
+              <w:t xml:space="preserve">269.88     </w:t>
+            </w:r>
           </w:p>
         </w:tc>
         <w:tc>
@@ -1620,6 +1894,9 @@
               <w:pStyle w:val="NoSpacing"/>
               <w:jc w:val="both"/>
             </w:pPr>
+            <w:r>
+              <w:t xml:space="preserve">468.32     </w:t>
+            </w:r>
           </w:p>
         </w:tc>
         <w:tc>
@@ -1631,6 +1908,9 @@
               <w:pStyle w:val="NoSpacing"/>
               <w:jc w:val="both"/>
             </w:pPr>
+            <w:r>
+              <w:t xml:space="preserve">904.39     </w:t>
+            </w:r>
           </w:p>
         </w:tc>
         <w:tc>
@@ -1642,6 +1922,9 @@
               <w:pStyle w:val="NoSpacing"/>
               <w:jc w:val="both"/>
             </w:pPr>
+            <w:r>
+              <w:t xml:space="preserve">728.13     </w:t>
+            </w:r>
           </w:p>
         </w:tc>
         <w:tc>
@@ -1653,6 +1936,9 @@
               <w:pStyle w:val="NoSpacing"/>
               <w:jc w:val="both"/>
             </w:pPr>
+            <w:r>
+              <w:t>504.94</w:t>
+            </w:r>
           </w:p>
         </w:tc>
       </w:tr>
@@ -1667,8 +1953,13 @@
               <w:pStyle w:val="NoSpacing"/>
               <w:jc w:val="center"/>
             </w:pPr>
-            <w:r>
-              <w:t>v (m/s)</w:t>
+            <w:proofErr w:type="gramStart"/>
+            <w:r>
+              <w:t>v</w:t>
+            </w:r>
+            <w:proofErr w:type="gramEnd"/>
+            <w:r>
+              <w:t xml:space="preserve"> (m/s)</w:t>
             </w:r>
           </w:p>
         </w:tc>
@@ -1681,6 +1972,9 @@
               <w:pStyle w:val="NoSpacing"/>
               <w:jc w:val="both"/>
             </w:pPr>
+            <w:r>
+              <w:t>200.00</w:t>
+            </w:r>
           </w:p>
         </w:tc>
         <w:tc>
@@ -1692,6 +1986,9 @@
               <w:pStyle w:val="NoSpacing"/>
               <w:jc w:val="both"/>
             </w:pPr>
+            <w:r>
+              <w:t>0.00</w:t>
+            </w:r>
           </w:p>
         </w:tc>
         <w:tc>
@@ -1703,6 +2000,9 @@
               <w:pStyle w:val="NoSpacing"/>
               <w:jc w:val="both"/>
             </w:pPr>
+            <w:r>
+              <w:t>0.00</w:t>
+            </w:r>
           </w:p>
         </w:tc>
         <w:tc>
@@ -1714,6 +2014,9 @@
               <w:pStyle w:val="NoSpacing"/>
               <w:jc w:val="both"/>
             </w:pPr>
+            <w:r>
+              <w:t>0.00</w:t>
+            </w:r>
           </w:p>
         </w:tc>
         <w:tc>
@@ -1725,6 +2028,9 @@
               <w:pStyle w:val="NoSpacing"/>
               <w:jc w:val="both"/>
             </w:pPr>
+            <w:r>
+              <w:t>0.00</w:t>
+            </w:r>
           </w:p>
         </w:tc>
         <w:tc>
@@ -1735,7 +2041,16 @@
             <w:pPr>
               <w:pStyle w:val="NoSpacing"/>
               <w:jc w:val="both"/>
-            </w:pPr>
+              <w:rPr>
+                <w:lang w:val="en-NL"/>
+              </w:rPr>
+            </w:pPr>
+            <w:r>
+              <w:rPr>
+                <w:lang w:val="en-NL"/>
+              </w:rPr>
+              <w:t>696.01</w:t>
+            </w:r>
           </w:p>
         </w:tc>
       </w:tr>
@@ -1755,18 +2070,27 @@
                 <w:i/>
               </w:rPr>
             </w:pPr>
+            <w:proofErr w:type="spellStart"/>
             <w:r>
               <w:rPr>
                 <w:b/>
                 <w:i/>
               </w:rPr>
-              <w:t xml:space="preserve">Table </w:t>
-            </w:r>
+              <w:t>Table</w:t>
+            </w:r>
+            <w:proofErr w:type="spellEnd"/>
             <w:r>
               <w:rPr>
                 <w:b/>
                 <w:i/>
               </w:rPr>
+              <w:t xml:space="preserve"> </w:t>
+            </w:r>
+            <w:r>
+              <w:rPr>
+                <w:b/>
+                <w:i/>
+              </w:rPr>
               <w:t>1</w:t>
             </w:r>
             <w:r>
@@ -1774,7 +2098,23 @@
                 <w:b/>
                 <w:i/>
               </w:rPr>
-              <w:t>: Thermodynamic state summary</w:t>
+              <w:t xml:space="preserve">: </w:t>
+            </w:r>
+            <w:proofErr w:type="spellStart"/>
+            <w:r>
+              <w:rPr>
+                <w:b/>
+                <w:i/>
+              </w:rPr>
+              <w:t>Thermodynamic</w:t>
+            </w:r>
+            <w:proofErr w:type="spellEnd"/>
+            <w:r>
+              <w:rPr>
+                <w:b/>
+                <w:i/>
+              </w:rPr>
+              <w:t xml:space="preserve"> state summary</w:t>
             </w:r>
           </w:p>
         </w:tc>
@@ -1991,7 +2331,27 @@
           <w:color w:val="000000" w:themeColor="text1"/>
           <w:lang w:val="en-US"/>
         </w:rPr>
-        <w:t xml:space="preserve">This just an </w:t>
+        <w:t xml:space="preserve">This </w:t>
+      </w:r>
+      <w:proofErr w:type="gramStart"/>
+      <w:r>
+        <w:rPr>
+          <w:b w:val="0"/>
+          <w:bCs w:val="0"/>
+          <w:color w:val="000000" w:themeColor="text1"/>
+          <w:lang w:val="en-US"/>
+        </w:rPr>
+        <w:t>just</w:t>
+      </w:r>
+      <w:proofErr w:type="gramEnd"/>
+      <w:r>
+        <w:rPr>
+          <w:b w:val="0"/>
+          <w:bCs w:val="0"/>
+          <w:color w:val="000000" w:themeColor="text1"/>
+          <w:lang w:val="en-US"/>
+        </w:rPr>
+        <w:t xml:space="preserve"> an </w:t>
       </w:r>
       <w:r>
         <w:rPr>
@@ -2088,10 +2448,10 @@
             <v:path o:extrusionok="f" gradientshapeok="t" o:connecttype="rect"/>
             <o:lock v:ext="edit" aspectratio="t"/>
           </v:shapetype>
-          <v:shape id="_x0000_i1028" type="#_x0000_t75" alt="" style="width:105.35pt;height:30.65pt;mso-width-percent:0;mso-height-percent:0;mso-width-percent:0;mso-height-percent:0" o:ole="">
+          <v:shape id="_x0000_i1025" type="#_x0000_t75" alt="" style="width:105.6pt;height:30.6pt;mso-width-percent:0;mso-height-percent:0;mso-width-percent:0;mso-height-percent:0" o:ole="">
             <v:imagedata r:id="rId8" o:title=""/>
           </v:shape>
-          <o:OLEObject Type="Embed" ProgID="Equation.DSMT4" ShapeID="_x0000_i1028" DrawAspect="Content" ObjectID="_1849872929" r:id="rId9"/>
+          <o:OLEObject Type="Embed" ProgID="Equation.DSMT4" ShapeID="_x0000_i1025" DrawAspect="Content" ObjectID="_1852821194" r:id="rId9"/>
         </w:object>
       </w:r>
     </w:p>
@@ -2103,11 +2463,19 @@
           <w:lang w:val="en-US"/>
         </w:rPr>
       </w:pPr>
-      <w:r>
-        <w:rPr>
-          <w:lang w:val="en-US"/>
-        </w:rPr>
-        <w:t xml:space="preserve">to determine </w:t>
+      <w:proofErr w:type="gramStart"/>
+      <w:r>
+        <w:rPr>
+          <w:lang w:val="en-US"/>
+        </w:rPr>
+        <w:t>to</w:t>
+      </w:r>
+      <w:proofErr w:type="gramEnd"/>
+      <w:r>
+        <w:rPr>
+          <w:lang w:val="en-US"/>
+        </w:rPr>
+        <w:t xml:space="preserve"> determine </w:t>
       </w:r>
       <w:r>
         <w:rPr>
@@ -2159,7 +2527,21 @@
         <w:rPr>
           <w:lang w:val="en-US"/>
         </w:rPr>
-        <w:t>to solve for the pressure</w:t>
+        <w:t xml:space="preserve">to </w:t>
+      </w:r>
+      <w:proofErr w:type="gramStart"/>
+      <w:r>
+        <w:rPr>
+          <w:lang w:val="en-US"/>
+        </w:rPr>
+        <w:t>solve for</w:t>
+      </w:r>
+      <w:proofErr w:type="gramEnd"/>
+      <w:r>
+        <w:rPr>
+          <w:lang w:val="en-US"/>
+        </w:rPr>
+        <w:t xml:space="preserve"> the pressure</w:t>
       </w:r>
       <w:r>
         <w:rPr>
@@ -2189,10 +2571,10 @@
           <w:position w:val="-4"/>
         </w:rPr>
         <w:object w:dxaOrig="180" w:dyaOrig="279" w14:anchorId="5FFEB742">
-          <v:shape id="_x0000_i1027" type="#_x0000_t75" alt="" style="width:8.65pt;height:14pt;mso-width-percent:0;mso-height-percent:0;mso-width-percent:0;mso-height-percent:0" o:ole="">
+          <v:shape id="_x0000_i1026" type="#_x0000_t75" alt="" style="width:8.4pt;height:13.8pt;mso-width-percent:0;mso-height-percent:0;mso-width-percent:0;mso-height-percent:0" o:ole="">
             <v:imagedata r:id="rId10" o:title=""/>
           </v:shape>
-          <o:OLEObject Type="Embed" ProgID="Equation.DSMT4" ShapeID="_x0000_i1027" DrawAspect="Content" ObjectID="_1849872930" r:id="rId11"/>
+          <o:OLEObject Type="Embed" ProgID="Equation.DSMT4" ShapeID="_x0000_i1026" DrawAspect="Content" ObjectID="_1852821195" r:id="rId11"/>
         </w:object>
       </w:r>
       <w:r>
@@ -2201,10 +2583,10 @@
           <w:position w:val="-36"/>
         </w:rPr>
         <w:object w:dxaOrig="5520" w:dyaOrig="820" w14:anchorId="5B5EAC29">
-          <v:shape id="_x0000_i1026" type="#_x0000_t75" alt="" style="width:276pt;height:41.35pt;mso-width-percent:0;mso-height-percent:0;mso-width-percent:0;mso-height-percent:0" o:ole="">
+          <v:shape id="_x0000_i1027" type="#_x0000_t75" alt="" style="width:276pt;height:41.4pt;mso-width-percent:0;mso-height-percent:0;mso-width-percent:0;mso-height-percent:0" o:ole="">
             <v:imagedata r:id="rId12" o:title=""/>
           </v:shape>
-          <o:OLEObject Type="Embed" ProgID="Equation.DSMT4" ShapeID="_x0000_i1026" DrawAspect="Content" ObjectID="_1849872931" r:id="rId13"/>
+          <o:OLEObject Type="Embed" ProgID="Equation.DSMT4" ShapeID="_x0000_i1027" DrawAspect="Content" ObjectID="_1852821196" r:id="rId13"/>
         </w:object>
       </w:r>
       <w:r>
@@ -2258,7 +2640,21 @@
         <w:rPr>
           <w:lang w:val="en-US"/>
         </w:rPr>
-        <w:t xml:space="preserve">Mixture properties determined using f.i. </w:t>
+        <w:t xml:space="preserve">Mixture properties determined using </w:t>
+      </w:r>
+      <w:proofErr w:type="spellStart"/>
+      <w:r>
+        <w:rPr>
+          <w:lang w:val="en-US"/>
+        </w:rPr>
+        <w:t>f.i</w:t>
+      </w:r>
+      <w:proofErr w:type="spellEnd"/>
+      <w:r>
+        <w:rPr>
+          <w:lang w:val="en-US"/>
+        </w:rPr>
+        <w:t xml:space="preserve">. </w:t>
       </w:r>
       <w:r>
         <w:rPr>
@@ -2292,10 +2688,10 @@
           <w:position w:val="-28"/>
         </w:rPr>
         <w:object w:dxaOrig="1780" w:dyaOrig="540" w14:anchorId="12AA07A4">
-          <v:shape id="_x0000_i1025" type="#_x0000_t75" alt="" style="width:89.35pt;height:27.35pt;mso-width-percent:0;mso-height-percent:0;mso-width-percent:0;mso-height-percent:0" o:ole="">
+          <v:shape id="_x0000_i1028" type="#_x0000_t75" alt="" style="width:89.4pt;height:27.6pt;mso-width-percent:0;mso-height-percent:0;mso-width-percent:0;mso-height-percent:0" o:ole="">
             <v:imagedata r:id="rId14" o:title=""/>
           </v:shape>
-          <o:OLEObject Type="Embed" ProgID="Equation.DSMT4" ShapeID="_x0000_i1025" DrawAspect="Content" ObjectID="_1849872932" r:id="rId15"/>
+          <o:OLEObject Type="Embed" ProgID="Equation.DSMT4" ShapeID="_x0000_i1028" DrawAspect="Content" ObjectID="_1852821197" r:id="rId15"/>
         </w:object>
       </w:r>
     </w:p>
@@ -2432,7 +2828,15 @@
               <w:jc w:val="both"/>
             </w:pPr>
             <w:r>
-              <w:t>Code snippet Compressor [2-3]</w:t>
+              <w:t xml:space="preserve">Code </w:t>
+            </w:r>
+            <w:proofErr w:type="spellStart"/>
+            <w:r>
+              <w:t>snippet</w:t>
+            </w:r>
+            <w:proofErr w:type="spellEnd"/>
+            <w:r>
+              <w:t xml:space="preserve"> Compressor [2-3]</w:t>
             </w:r>
           </w:p>
         </w:tc>
@@ -2471,10 +2875,12 @@
       <w:pPr>
         <w:pStyle w:val="Heading2"/>
       </w:pPr>
+      <w:proofErr w:type="spellStart"/>
       <w:r>
         <w:lastRenderedPageBreak/>
         <w:t>Combustor</w:t>
       </w:r>
+      <w:proofErr w:type="spellEnd"/>
       <w:r>
         <w:t xml:space="preserve"> (2 code snippets)</w:t>
       </w:r>
@@ -2617,13 +3023,27 @@
               <w:rPr>
                 <w:lang w:val="en-US"/>
               </w:rPr>
-              <w:t xml:space="preserve">thermodynamic computations </w:t>
-            </w:r>
-            <w:r>
-              <w:rPr>
-                <w:lang w:val="en-US"/>
-              </w:rPr>
-              <w:t xml:space="preserve"> [3-4]</w:t>
+              <w:t xml:space="preserve">thermodynamic </w:t>
+            </w:r>
+            <w:proofErr w:type="gramStart"/>
+            <w:r>
+              <w:rPr>
+                <w:lang w:val="en-US"/>
+              </w:rPr>
+              <w:t xml:space="preserve">computations </w:t>
+            </w:r>
+            <w:r>
+              <w:rPr>
+                <w:lang w:val="en-US"/>
+              </w:rPr>
+              <w:t xml:space="preserve"> [</w:t>
+            </w:r>
+            <w:proofErr w:type="gramEnd"/>
+            <w:r>
+              <w:rPr>
+                <w:lang w:val="en-US"/>
+              </w:rPr>
+              <w:t>3-4]</w:t>
             </w:r>
           </w:p>
         </w:tc>
@@ -2762,7 +3182,7 @@
       <w:tblGrid>
         <w:gridCol w:w="1738"/>
         <w:gridCol w:w="1901"/>
-        <w:gridCol w:w="1739"/>
+        <w:gridCol w:w="1878"/>
       </w:tblGrid>
       <w:tr>
         <w:tc>
@@ -2787,7 +3207,7 @@
         </w:tc>
         <w:tc>
           <w:tcPr>
-            <w:tcW w:w="3640" w:type="dxa"/>
+            <w:tcW w:w="3779" w:type="dxa"/>
             <w:gridSpan w:val="2"/>
             <w:tcBorders>
               <w:top w:val="single" w:sz="18" w:space="0" w:color="auto"/>
@@ -2816,13 +3236,9 @@
             <w:r>
               <w:rPr>
                 <w:b/>
-                <w:color w:val="C00000"/>
-                <w:sz w:val="32"/>
-                <w:szCs w:val="32"/>
-                <w:highlight w:val="yellow"/>
-                <w:lang w:val="en-US"/>
-              </w:rPr>
-              <w:t>?</w:t>
+                <w:lang w:val="en-US"/>
+              </w:rPr>
+              <w:t>102.78</w:t>
             </w:r>
             <w:r>
               <w:rPr>
@@ -2868,12 +3284,18 @@
               <w:rPr>
                 <w:b/>
                 <w:color w:val="C00000"/>
-                <w:sz w:val="32"/>
-                <w:szCs w:val="32"/>
-                <w:highlight w:val="yellow"/>
-                <w:lang w:val="en-US"/>
-              </w:rPr>
-              <w:t>?</w:t>
+                <w:lang w:val="en-US"/>
+              </w:rPr>
+              <w:t>0.</w:t>
+            </w:r>
+            <w:proofErr w:type="gramStart"/>
+            <w:r>
+              <w:rPr>
+                <w:b/>
+                <w:color w:val="C00000"/>
+                <w:lang w:val="en-US"/>
+              </w:rPr>
+              <w:t>167</w:t>
             </w:r>
             <w:r>
               <w:rPr>
@@ -2891,6 +3313,7 @@
               </w:rPr>
               <w:t>)</w:t>
             </w:r>
+            <w:proofErr w:type="gramEnd"/>
           </w:p>
         </w:tc>
       </w:tr>
@@ -2962,7 +3385,7 @@
         </w:tc>
         <w:tc>
           <w:tcPr>
-            <w:tcW w:w="1739" w:type="dxa"/>
+            <w:tcW w:w="1878" w:type="dxa"/>
             <w:tcBorders>
               <w:top w:val="single" w:sz="18" w:space="0" w:color="auto"/>
               <w:left w:val="single" w:sz="12" w:space="0" w:color="auto"/>
@@ -3029,16 +3452,21 @@
           <w:p>
             <w:pPr>
               <w:pStyle w:val="ListParagraph"/>
-              <w:ind w:left="0"/>
-              <w:rPr>
-                <w:lang w:val="en-US"/>
-              </w:rPr>
-            </w:pPr>
-          </w:p>
-        </w:tc>
-        <w:tc>
-          <w:tcPr>
-            <w:tcW w:w="1739" w:type="dxa"/>
+              <w:rPr>
+                <w:lang w:val="en-NL"/>
+              </w:rPr>
+            </w:pPr>
+            <w:r>
+              <w:rPr>
+                <w:lang w:val="en-NL"/>
+              </w:rPr>
+              <w:t>0.009636</w:t>
+            </w:r>
+          </w:p>
+        </w:tc>
+        <w:tc>
+          <w:tcPr>
+            <w:tcW w:w="1878" w:type="dxa"/>
             <w:tcBorders>
               <w:top w:val="single" w:sz="18" w:space="0" w:color="auto"/>
               <w:left w:val="single" w:sz="12" w:space="0" w:color="auto"/>
@@ -3049,11 +3477,16 @@
           <w:p>
             <w:pPr>
               <w:pStyle w:val="ListParagraph"/>
-              <w:ind w:left="0"/>
-              <w:rPr>
-                <w:lang w:val="en-US"/>
-              </w:rPr>
-            </w:pPr>
+              <w:rPr>
+                <w:lang w:val="en-NL"/>
+              </w:rPr>
+            </w:pPr>
+            <w:r>
+              <w:rPr>
+                <w:lang w:val="en-NL"/>
+              </w:rPr>
+              <w:t>0.000000</w:t>
+            </w:r>
           </w:p>
         </w:tc>
       </w:tr>
@@ -3102,16 +3535,21 @@
           <w:p>
             <w:pPr>
               <w:pStyle w:val="ListParagraph"/>
-              <w:ind w:left="0"/>
-              <w:rPr>
-                <w:lang w:val="en-US"/>
-              </w:rPr>
-            </w:pPr>
-          </w:p>
-        </w:tc>
-        <w:tc>
-          <w:tcPr>
-            <w:tcW w:w="1739" w:type="dxa"/>
+              <w:rPr>
+                <w:lang w:val="en-NL"/>
+              </w:rPr>
+            </w:pPr>
+            <w:r>
+              <w:rPr>
+                <w:lang w:val="en-NL"/>
+              </w:rPr>
+              <w:t>0.230673</w:t>
+            </w:r>
+          </w:p>
+        </w:tc>
+        <w:tc>
+          <w:tcPr>
+            <w:tcW w:w="1878" w:type="dxa"/>
             <w:tcBorders>
               <w:left w:val="single" w:sz="12" w:space="0" w:color="auto"/>
               <w:right w:val="single" w:sz="18" w:space="0" w:color="auto"/>
@@ -3121,11 +3559,22 @@
           <w:p>
             <w:pPr>
               <w:pStyle w:val="ListParagraph"/>
-              <w:ind w:left="0"/>
-              <w:rPr>
-                <w:lang w:val="en-US"/>
-              </w:rPr>
-            </w:pPr>
+              <w:rPr>
+                <w:lang w:val="en-NL"/>
+              </w:rPr>
+            </w:pPr>
+            <w:r>
+              <w:rPr>
+                <w:lang w:val="en-US"/>
+              </w:rPr>
+              <w:t>0.1</w:t>
+            </w:r>
+            <w:r>
+              <w:rPr>
+                <w:lang w:val="en-NL"/>
+              </w:rPr>
+              <w:t>92235</w:t>
+            </w:r>
           </w:p>
         </w:tc>
       </w:tr>
@@ -3174,16 +3623,21 @@
           <w:p>
             <w:pPr>
               <w:pStyle w:val="ListParagraph"/>
-              <w:ind w:left="0"/>
-              <w:rPr>
-                <w:lang w:val="en-US"/>
-              </w:rPr>
-            </w:pPr>
-          </w:p>
-        </w:tc>
-        <w:tc>
-          <w:tcPr>
-            <w:tcW w:w="1739" w:type="dxa"/>
+              <w:rPr>
+                <w:lang w:val="en-NL"/>
+              </w:rPr>
+            </w:pPr>
+            <w:r>
+              <w:rPr>
+                <w:lang w:val="en-NL"/>
+              </w:rPr>
+              <w:t>0.759691</w:t>
+            </w:r>
+          </w:p>
+        </w:tc>
+        <w:tc>
+          <w:tcPr>
+            <w:tcW w:w="1878" w:type="dxa"/>
             <w:tcBorders>
               <w:left w:val="single" w:sz="12" w:space="0" w:color="auto"/>
               <w:right w:val="single" w:sz="18" w:space="0" w:color="auto"/>
@@ -3193,11 +3647,16 @@
           <w:p>
             <w:pPr>
               <w:pStyle w:val="ListParagraph"/>
-              <w:ind w:left="0"/>
-              <w:rPr>
-                <w:lang w:val="en-US"/>
-              </w:rPr>
-            </w:pPr>
+              <w:rPr>
+                <w:lang w:val="en-NL"/>
+              </w:rPr>
+            </w:pPr>
+            <w:r>
+              <w:rPr>
+                <w:lang w:val="en-NL"/>
+              </w:rPr>
+              <w:t>0.026433</w:t>
+            </w:r>
           </w:p>
         </w:tc>
       </w:tr>
@@ -3246,16 +3705,21 @@
           <w:p>
             <w:pPr>
               <w:pStyle w:val="ListParagraph"/>
-              <w:ind w:left="0"/>
-              <w:rPr>
-                <w:lang w:val="en-US"/>
-              </w:rPr>
-            </w:pPr>
-          </w:p>
-        </w:tc>
-        <w:tc>
-          <w:tcPr>
-            <w:tcW w:w="1739" w:type="dxa"/>
+              <w:rPr>
+                <w:lang w:val="en-NL"/>
+              </w:rPr>
+            </w:pPr>
+            <w:r>
+              <w:rPr>
+                <w:lang w:val="en-NL"/>
+              </w:rPr>
+              <w:t>0.000000</w:t>
+            </w:r>
+          </w:p>
+        </w:tc>
+        <w:tc>
+          <w:tcPr>
+            <w:tcW w:w="1878" w:type="dxa"/>
             <w:tcBorders>
               <w:left w:val="single" w:sz="12" w:space="0" w:color="auto"/>
               <w:right w:val="single" w:sz="18" w:space="0" w:color="auto"/>
@@ -3265,11 +3729,16 @@
           <w:p>
             <w:pPr>
               <w:pStyle w:val="ListParagraph"/>
-              <w:ind w:left="0"/>
-              <w:rPr>
-                <w:lang w:val="en-US"/>
-              </w:rPr>
-            </w:pPr>
+              <w:rPr>
+                <w:lang w:val="en-NL"/>
+              </w:rPr>
+            </w:pPr>
+            <w:r>
+              <w:rPr>
+                <w:lang w:val="en-NL"/>
+              </w:rPr>
+              <w:t>0.021641</w:t>
+            </w:r>
           </w:p>
         </w:tc>
       </w:tr>
@@ -3326,16 +3795,21 @@
           <w:p>
             <w:pPr>
               <w:pStyle w:val="ListParagraph"/>
-              <w:ind w:left="0"/>
-              <w:rPr>
-                <w:lang w:val="en-US"/>
-              </w:rPr>
-            </w:pPr>
-          </w:p>
-        </w:tc>
-        <w:tc>
-          <w:tcPr>
-            <w:tcW w:w="1739" w:type="dxa"/>
+              <w:rPr>
+                <w:lang w:val="en-NL"/>
+              </w:rPr>
+            </w:pPr>
+            <w:r>
+              <w:rPr>
+                <w:lang w:val="en-NL"/>
+              </w:rPr>
+              <w:t>0.000000</w:t>
+            </w:r>
+          </w:p>
+        </w:tc>
+        <w:tc>
+          <w:tcPr>
+            <w:tcW w:w="1878" w:type="dxa"/>
             <w:tcBorders>
               <w:left w:val="single" w:sz="12" w:space="0" w:color="auto"/>
               <w:bottom w:val="single" w:sz="18" w:space="0" w:color="auto"/>
@@ -3346,11 +3820,16 @@
           <w:p>
             <w:pPr>
               <w:pStyle w:val="ListParagraph"/>
-              <w:ind w:left="0"/>
-              <w:rPr>
-                <w:lang w:val="en-US"/>
-              </w:rPr>
-            </w:pPr>
+              <w:rPr>
+                <w:lang w:val="en-NL"/>
+              </w:rPr>
+            </w:pPr>
+            <w:r>
+              <w:rPr>
+                <w:lang w:val="en-NL"/>
+              </w:rPr>
+              <w:t>0.759691</w:t>
+            </w:r>
           </w:p>
         </w:tc>
       </w:tr>
@@ -3373,6 +3852,7 @@
                 <w:lang w:val="en-US"/>
               </w:rPr>
             </w:pPr>
+            <w:proofErr w:type="spellStart"/>
             <w:r>
               <w:rPr>
                 <w:lang w:val="en-US"/>
@@ -3386,6 +3866,7 @@
               </w:rPr>
               <w:t>g</w:t>
             </w:r>
+            <w:proofErr w:type="spellEnd"/>
             <w:r>
               <w:rPr>
                 <w:lang w:val="en-US"/>
@@ -3407,16 +3888,21 @@
           <w:p>
             <w:pPr>
               <w:pStyle w:val="ListParagraph"/>
-              <w:ind w:left="0"/>
-              <w:rPr>
-                <w:lang w:val="en-US"/>
-              </w:rPr>
-            </w:pPr>
-          </w:p>
-        </w:tc>
-        <w:tc>
-          <w:tcPr>
-            <w:tcW w:w="1739" w:type="dxa"/>
+              <w:rPr>
+                <w:lang w:val="en-NL"/>
+              </w:rPr>
+            </w:pPr>
+            <w:r>
+              <w:rPr>
+                <w:lang w:val="en-NL"/>
+              </w:rPr>
+              <w:t>290.410</w:t>
+            </w:r>
+          </w:p>
+        </w:tc>
+        <w:tc>
+          <w:tcPr>
+            <w:tcW w:w="1878" w:type="dxa"/>
             <w:tcBorders>
               <w:left w:val="single" w:sz="12" w:space="0" w:color="auto"/>
               <w:bottom w:val="single" w:sz="18" w:space="0" w:color="auto"/>
@@ -3427,18 +3913,23 @@
           <w:p>
             <w:pPr>
               <w:pStyle w:val="ListParagraph"/>
-              <w:ind w:left="0"/>
-              <w:rPr>
-                <w:lang w:val="en-US"/>
-              </w:rPr>
-            </w:pPr>
+              <w:rPr>
+                <w:lang w:val="en-NL"/>
+              </w:rPr>
+            </w:pPr>
+            <w:r>
+              <w:rPr>
+                <w:lang w:val="en-NL"/>
+              </w:rPr>
+              <w:t>290.410</w:t>
+            </w:r>
           </w:p>
         </w:tc>
       </w:tr>
       <w:tr>
         <w:tc>
           <w:tcPr>
-            <w:tcW w:w="5378" w:type="dxa"/>
+            <w:tcW w:w="5517" w:type="dxa"/>
             <w:gridSpan w:val="3"/>
             <w:tcBorders>
               <w:top w:val="single" w:sz="18" w:space="0" w:color="auto"/>
@@ -3802,7 +4293,7 @@
 </file>
 
 <file path=word/endnotes.xml><?xml version="1.0" encoding="utf-8"?>
-<w:endnotes xmlns:wpc="http://schemas.microsoft.com/office/word/2010/wordprocessingCanvas" xmlns:cx="http://schemas.microsoft.com/office/drawing/2014/chartex" xmlns:cx1="http://schemas.microsoft.com/office/drawing/2015/9/8/chartex" xmlns:cx2="http://schemas.microsoft.com/office/drawing/2015/10/21/chartex" xmlns:cx3="http://schemas.microsoft.com/office/drawing/2016/5/9/chartex" xmlns:cx4="http://schemas.microsoft.com/office/drawing/2016/5/10/chartex" xmlns:cx5="http://schemas.microsoft.com/office/drawing/2016/5/11/chartex" xmlns:cx6="http://schemas.microsoft.com/office/drawing/2016/5/12/chartex" xmlns:cx7="http://schemas.microsoft.com/office/drawing/2016/5/13/chartex" xmlns:cx8="http://schemas.microsoft.com/office/drawing/2016/5/14/chartex" xmlns:mc="http://schemas.openxmlformats.org/markup-compatibility/2006" xmlns:m="http://schemas.openxmlformats.org/officeDocument/2006/math" xmlns:aink="http://schemas.microsoft.com/office/drawing/2016/ink" xmlns:am3d="http://schemas.microsoft.com/office/drawing/2017/model3d" xmlns:oel="http://schemas.microsoft.com/office/2019/extlst" xmlns:r="http://schemas.openxmlformats.org/officeDocument/2006/relationships" xmlns:wp14="http://schemas.microsoft.com/office/word/2010/wordprocessingDrawing" xmlns:wp="http://schemas.openxmlformats.org/drawingml/2006/wordprocessingDrawing" xmlns:wpg="http://schemas.microsoft.com/office/word/2010/wordprocessingGroup" xmlns:wpi="http://schemas.microsoft.com/office/word/2010/wordprocessingInk" xmlns:wps="http://schemas.microsoft.com/office/word/2010/wordprocessingShape" xmlns:o="urn:schemas-microsoft-com:office:office" xmlns:v="urn:schemas-microsoft-com:vml" xmlns:w10="urn:schemas-microsoft-com:office:word" xmlns:w="http://schemas.openxmlformats.org/wordprocessingml/2006/main" xmlns:w14="http://schemas.microsoft.com/office/word/2010/wordml" xmlns:w15="http://schemas.microsoft.com/office/word/2012/wordml" xmlns:w16cex="http://schemas.microsoft.com/office/word/2018/wordml/cex" xmlns:w16cid="http://schemas.microsoft.com/office/word/2016/wordml/cid" xmlns:w16="http://schemas.microsoft.com/office/word/2018/wordml" xmlns:w16sdtdh="http://schemas.microsoft.com/office/word/2020/wordml/sdtdatahash" xmlns:w16sdtfl="http://schemas.microsoft.com/office/word/2024/wordml/sdtformatlock" xmlns:w16se="http://schemas.microsoft.com/office/word/2015/wordml/symex" xmlns:w16du="http://schemas.microsoft.com/office/word/2023/wordml/word16du" xmlns:wne="http://schemas.microsoft.com/office/word/2006/wordml" mc:Ignorable="w14 w15 w16se w16cid w16 w16cex w16sdtdh w16sdtfl w16du wp14">
+<w:endnotes xmlns:wpc="http://schemas.microsoft.com/office/word/2010/wordprocessingCanvas" xmlns:cx="http://schemas.microsoft.com/office/drawing/2014/chartex" xmlns:cx1="http://schemas.microsoft.com/office/drawing/2015/9/8/chartex" xmlns:cx2="http://schemas.microsoft.com/office/drawing/2015/10/21/chartex" xmlns:cx3="http://schemas.microsoft.com/office/drawing/2016/5/9/chartex" xmlns:cx4="http://schemas.microsoft.com/office/drawing/2016/5/10/chartex" xmlns:cx5="http://schemas.microsoft.com/office/drawing/2016/5/11/chartex" xmlns:cx6="http://schemas.microsoft.com/office/drawing/2016/5/12/chartex" xmlns:cx7="http://schemas.microsoft.com/office/drawing/2016/5/13/chartex" xmlns:cx8="http://schemas.microsoft.com/office/drawing/2016/5/14/chartex" xmlns:mc="http://schemas.openxmlformats.org/markup-compatibility/2006" xmlns:aink="http://schemas.microsoft.com/office/drawing/2016/ink" xmlns:am3d="http://schemas.microsoft.com/office/drawing/2017/model3d" xmlns:o="urn:schemas-microsoft-com:office:office" xmlns:oel="http://schemas.microsoft.com/office/2019/extlst" xmlns:r="http://schemas.openxmlformats.org/officeDocument/2006/relationships" xmlns:m="http://schemas.openxmlformats.org/officeDocument/2006/math" xmlns:v="urn:schemas-microsoft-com:vml" xmlns:wp14="http://schemas.microsoft.com/office/word/2010/wordprocessingDrawing" xmlns:wp="http://schemas.openxmlformats.org/drawingml/2006/wordprocessingDrawing" xmlns:w10="urn:schemas-microsoft-com:office:word" xmlns:w="http://schemas.openxmlformats.org/wordprocessingml/2006/main" xmlns:w14="http://schemas.microsoft.com/office/word/2010/wordml" xmlns:w15="http://schemas.microsoft.com/office/word/2012/wordml" xmlns:w16cex="http://schemas.microsoft.com/office/word/2018/wordml/cex" xmlns:w16cid="http://schemas.microsoft.com/office/word/2016/wordml/cid" xmlns:w16="http://schemas.microsoft.com/office/word/2018/wordml" xmlns:w16du="http://schemas.microsoft.com/office/word/2023/wordml/word16du" xmlns:w16sdtdh="http://schemas.microsoft.com/office/word/2020/wordml/sdtdatahash" xmlns:w16sdtfl="http://schemas.microsoft.com/office/word/2024/wordml/sdtformatlock" xmlns:w16se="http://schemas.microsoft.com/office/word/2015/wordml/symex" xmlns:wpg="http://schemas.microsoft.com/office/word/2010/wordprocessingGroup" xmlns:wpi="http://schemas.microsoft.com/office/word/2010/wordprocessingInk" xmlns:wne="http://schemas.microsoft.com/office/word/2006/wordml" xmlns:wps="http://schemas.microsoft.com/office/word/2010/wordprocessingShape" mc:Ignorable="w14 w15 w16se w16cid w16 w16cex w16sdtdh w16sdtfl w16du wp14">
   <w:endnote w:type="separator" w:id="-1">
     <w:p>
       <w:pPr>
@@ -3827,7 +4318,7 @@
 </file>
 
 <file path=word/footer1.xml><?xml version="1.0" encoding="utf-8"?>
-<w:ftr xmlns:wpc="http://schemas.microsoft.com/office/word/2010/wordprocessingCanvas" xmlns:cx="http://schemas.microsoft.com/office/drawing/2014/chartex" xmlns:cx1="http://schemas.microsoft.com/office/drawing/2015/9/8/chartex" xmlns:cx2="http://schemas.microsoft.com/office/drawing/2015/10/21/chartex" xmlns:cx3="http://schemas.microsoft.com/office/drawing/2016/5/9/chartex" xmlns:cx4="http://schemas.microsoft.com/office/drawing/2016/5/10/chartex" xmlns:cx5="http://schemas.microsoft.com/office/drawing/2016/5/11/chartex" xmlns:cx6="http://schemas.microsoft.com/office/drawing/2016/5/12/chartex" xmlns:cx7="http://schemas.microsoft.com/office/drawing/2016/5/13/chartex" xmlns:cx8="http://schemas.microsoft.com/office/drawing/2016/5/14/chartex" xmlns:mc="http://schemas.openxmlformats.org/markup-compatibility/2006" xmlns:m="http://schemas.openxmlformats.org/officeDocument/2006/math" xmlns:aink="http://schemas.microsoft.com/office/drawing/2016/ink" xmlns:am3d="http://schemas.microsoft.com/office/drawing/2017/model3d" xmlns:oel="http://schemas.microsoft.com/office/2019/extlst" xmlns:r="http://schemas.openxmlformats.org/officeDocument/2006/relationships" xmlns:wp14="http://schemas.microsoft.com/office/word/2010/wordprocessingDrawing" xmlns:wp="http://schemas.openxmlformats.org/drawingml/2006/wordprocessingDrawing" xmlns:wpg="http://schemas.microsoft.com/office/word/2010/wordprocessingGroup" xmlns:wpi="http://schemas.microsoft.com/office/word/2010/wordprocessingInk" xmlns:wps="http://schemas.microsoft.com/office/word/2010/wordprocessingShape" xmlns:o="urn:schemas-microsoft-com:office:office" xmlns:v="urn:schemas-microsoft-com:vml" xmlns:w10="urn:schemas-microsoft-com:office:word" xmlns:w="http://schemas.openxmlformats.org/wordprocessingml/2006/main" xmlns:w14="http://schemas.microsoft.com/office/word/2010/wordml" xmlns:w15="http://schemas.microsoft.com/office/word/2012/wordml" xmlns:w16cex="http://schemas.microsoft.com/office/word/2018/wordml/cex" xmlns:w16cid="http://schemas.microsoft.com/office/word/2016/wordml/cid" xmlns:w16="http://schemas.microsoft.com/office/word/2018/wordml" xmlns:w16sdtdh="http://schemas.microsoft.com/office/word/2020/wordml/sdtdatahash" xmlns:w16sdtfl="http://schemas.microsoft.com/office/word/2024/wordml/sdtformatlock" xmlns:w16se="http://schemas.microsoft.com/office/word/2015/wordml/symex" xmlns:w16du="http://schemas.microsoft.com/office/word/2023/wordml/word16du" xmlns:wne="http://schemas.microsoft.com/office/word/2006/wordml" mc:Ignorable="w14 w15 w16se w16cid w16 w16cex w16sdtdh w16sdtfl w16du wp14">
+<w:ftr xmlns:wpc="http://schemas.microsoft.com/office/word/2010/wordprocessingCanvas" xmlns:cx="http://schemas.microsoft.com/office/drawing/2014/chartex" xmlns:cx1="http://schemas.microsoft.com/office/drawing/2015/9/8/chartex" xmlns:cx2="http://schemas.microsoft.com/office/drawing/2015/10/21/chartex" xmlns:cx3="http://schemas.microsoft.com/office/drawing/2016/5/9/chartex" xmlns:cx4="http://schemas.microsoft.com/office/drawing/2016/5/10/chartex" xmlns:cx5="http://schemas.microsoft.com/office/drawing/2016/5/11/chartex" xmlns:cx6="http://schemas.microsoft.com/office/drawing/2016/5/12/chartex" xmlns:cx7="http://schemas.microsoft.com/office/drawing/2016/5/13/chartex" xmlns:cx8="http://schemas.microsoft.com/office/drawing/2016/5/14/chartex" xmlns:mc="http://schemas.openxmlformats.org/markup-compatibility/2006" xmlns:aink="http://schemas.microsoft.com/office/drawing/2016/ink" xmlns:am3d="http://schemas.microsoft.com/office/drawing/2017/model3d" xmlns:o="urn:schemas-microsoft-com:office:office" xmlns:oel="http://schemas.microsoft.com/office/2019/extlst" xmlns:r="http://schemas.openxmlformats.org/officeDocument/2006/relationships" xmlns:m="http://schemas.openxmlformats.org/officeDocument/2006/math" xmlns:v="urn:schemas-microsoft-com:vml" xmlns:wp14="http://schemas.microsoft.com/office/word/2010/wordprocessingDrawing" xmlns:wp="http://schemas.openxmlformats.org/drawingml/2006/wordprocessingDrawing" xmlns:w10="urn:schemas-microsoft-com:office:word" xmlns:w="http://schemas.openxmlformats.org/wordprocessingml/2006/main" xmlns:w14="http://schemas.microsoft.com/office/word/2010/wordml" xmlns:w15="http://schemas.microsoft.com/office/word/2012/wordml" xmlns:w16cex="http://schemas.microsoft.com/office/word/2018/wordml/cex" xmlns:w16cid="http://schemas.microsoft.com/office/word/2016/wordml/cid" xmlns:w16="http://schemas.microsoft.com/office/word/2018/wordml" xmlns:w16du="http://schemas.microsoft.com/office/word/2023/wordml/word16du" xmlns:w16sdtdh="http://schemas.microsoft.com/office/word/2020/wordml/sdtdatahash" xmlns:w16sdtfl="http://schemas.microsoft.com/office/word/2024/wordml/sdtformatlock" xmlns:w16se="http://schemas.microsoft.com/office/word/2015/wordml/symex" xmlns:wpg="http://schemas.microsoft.com/office/word/2010/wordprocessingGroup" xmlns:wpi="http://schemas.microsoft.com/office/word/2010/wordprocessingInk" xmlns:wne="http://schemas.microsoft.com/office/word/2006/wordml" xmlns:wps="http://schemas.microsoft.com/office/word/2010/wordprocessingShape" mc:Ignorable="w14 w15 w16se w16cid w16 w16cex w16sdtdh w16sdtfl w16du wp14">
   <w:p>
     <w:pPr>
       <w:pStyle w:val="Footer"/>
@@ -3970,7 +4461,7 @@
 </file>
 
 <file path=word/footnotes.xml><?xml version="1.0" encoding="utf-8"?>
-<w:footnotes xmlns:wpc="http://schemas.microsoft.com/office/word/2010/wordprocessingCanvas" xmlns:cx="http://schemas.microsoft.com/office/drawing/2014/chartex" xmlns:cx1="http://schemas.microsoft.com/office/drawing/2015/9/8/chartex" xmlns:cx2="http://schemas.microsoft.com/office/drawing/2015/10/21/chartex" xmlns:cx3="http://schemas.microsoft.com/office/drawing/2016/5/9/chartex" xmlns:cx4="http://schemas.microsoft.com/office/drawing/2016/5/10/chartex" xmlns:cx5="http://schemas.microsoft.com/office/drawing/2016/5/11/chartex" xmlns:cx6="http://schemas.microsoft.com/office/drawing/2016/5/12/chartex" xmlns:cx7="http://schemas.microsoft.com/office/drawing/2016/5/13/chartex" xmlns:cx8="http://schemas.microsoft.com/office/drawing/2016/5/14/chartex" xmlns:mc="http://schemas.openxmlformats.org/markup-compatibility/2006" xmlns:m="http://schemas.openxmlformats.org/officeDocument/2006/math" xmlns:aink="http://schemas.microsoft.com/office/drawing/2016/ink" xmlns:am3d="http://schemas.microsoft.com/office/drawing/2017/model3d" xmlns:oel="http://schemas.microsoft.com/office/2019/extlst" xmlns:r="http://schemas.openxmlformats.org/officeDocument/2006/relationships" xmlns:wp14="http://schemas.microsoft.com/office/word/2010/wordprocessingDrawing" xmlns:wp="http://schemas.openxmlformats.org/drawingml/2006/wordprocessingDrawing" xmlns:wpg="http://schemas.microsoft.com/office/word/2010/wordprocessingGroup" xmlns:wpi="http://schemas.microsoft.com/office/word/2010/wordprocessingInk" xmlns:wps="http://schemas.microsoft.com/office/word/2010/wordprocessingShape" xmlns:o="urn:schemas-microsoft-com:office:office" xmlns:v="urn:schemas-microsoft-com:vml" xmlns:w10="urn:schemas-microsoft-com:office:word" xmlns:w="http://schemas.openxmlformats.org/wordprocessingml/2006/main" xmlns:w14="http://schemas.microsoft.com/office/word/2010/wordml" xmlns:w15="http://schemas.microsoft.com/office/word/2012/wordml" xmlns:w16cex="http://schemas.microsoft.com/office/word/2018/wordml/cex" xmlns:w16cid="http://schemas.microsoft.com/office/word/2016/wordml/cid" xmlns:w16="http://schemas.microsoft.com/office/word/2018/wordml" xmlns:w16sdtdh="http://schemas.microsoft.com/office/word/2020/wordml/sdtdatahash" xmlns:w16sdtfl="http://schemas.microsoft.com/office/word/2024/wordml/sdtformatlock" xmlns:w16se="http://schemas.microsoft.com/office/word/2015/wordml/symex" xmlns:w16du="http://schemas.microsoft.com/office/word/2023/wordml/word16du" xmlns:wne="http://schemas.microsoft.com/office/word/2006/wordml" mc:Ignorable="w14 w15 w16se w16cid w16 w16cex w16sdtdh w16sdtfl w16du wp14">
+<w:footnotes xmlns:wpc="http://schemas.microsoft.com/office/word/2010/wordprocessingCanvas" xmlns:cx="http://schemas.microsoft.com/office/drawing/2014/chartex" xmlns:cx1="http://schemas.microsoft.com/office/drawing/2015/9/8/chartex" xmlns:cx2="http://schemas.microsoft.com/office/drawing/2015/10/21/chartex" xmlns:cx3="http://schemas.microsoft.com/office/drawing/2016/5/9/chartex" xmlns:cx4="http://schemas.microsoft.com/office/drawing/2016/5/10/chartex" xmlns:cx5="http://schemas.microsoft.com/office/drawing/2016/5/11/chartex" xmlns:cx6="http://schemas.microsoft.com/office/drawing/2016/5/12/chartex" xmlns:cx7="http://schemas.microsoft.com/office/drawing/2016/5/13/chartex" xmlns:cx8="http://schemas.microsoft.com/office/drawing/2016/5/14/chartex" xmlns:mc="http://schemas.openxmlformats.org/markup-compatibility/2006" xmlns:aink="http://schemas.microsoft.com/office/drawing/2016/ink" xmlns:am3d="http://schemas.microsoft.com/office/drawing/2017/model3d" xmlns:o="urn:schemas-microsoft-com:office:office" xmlns:oel="http://schemas.microsoft.com/office/2019/extlst" xmlns:r="http://schemas.openxmlformats.org/officeDocument/2006/relationships" xmlns:m="http://schemas.openxmlformats.org/officeDocument/2006/math" xmlns:v="urn:schemas-microsoft-com:vml" xmlns:wp14="http://schemas.microsoft.com/office/word/2010/wordprocessingDrawing" xmlns:wp="http://schemas.openxmlformats.org/drawingml/2006/wordprocessingDrawing" xmlns:w10="urn:schemas-microsoft-com:office:word" xmlns:w="http://schemas.openxmlformats.org/wordprocessingml/2006/main" xmlns:w14="http://schemas.microsoft.com/office/word/2010/wordml" xmlns:w15="http://schemas.microsoft.com/office/word/2012/wordml" xmlns:w16cex="http://schemas.microsoft.com/office/word/2018/wordml/cex" xmlns:w16cid="http://schemas.microsoft.com/office/word/2016/wordml/cid" xmlns:w16="http://schemas.microsoft.com/office/word/2018/wordml" xmlns:w16du="http://schemas.microsoft.com/office/word/2023/wordml/word16du" xmlns:w16sdtdh="http://schemas.microsoft.com/office/word/2020/wordml/sdtdatahash" xmlns:w16sdtfl="http://schemas.microsoft.com/office/word/2024/wordml/sdtformatlock" xmlns:w16se="http://schemas.microsoft.com/office/word/2015/wordml/symex" xmlns:wpg="http://schemas.microsoft.com/office/word/2010/wordprocessingGroup" xmlns:wpi="http://schemas.microsoft.com/office/word/2010/wordprocessingInk" xmlns:wne="http://schemas.microsoft.com/office/word/2006/wordml" xmlns:wps="http://schemas.microsoft.com/office/word/2010/wordprocessingShape" mc:Ignorable="w14 w15 w16se w16cid w16 w16cex w16sdtdh w16sdtfl w16du wp14">
   <w:footnote w:type="separator" w:id="-1">
     <w:p>
       <w:pPr>
@@ -3995,7 +4486,7 @@
 </file>
 
 <file path=word/numbering.xml><?xml version="1.0" encoding="utf-8"?>
-<w:numbering xmlns:wpc="http://schemas.microsoft.com/office/word/2010/wordprocessingCanvas" xmlns:cx="http://schemas.microsoft.com/office/drawing/2014/chartex" xmlns:cx1="http://schemas.microsoft.com/office/drawing/2015/9/8/chartex" xmlns:cx2="http://schemas.microsoft.com/office/drawing/2015/10/21/chartex" xmlns:cx3="http://schemas.microsoft.com/office/drawing/2016/5/9/chartex" xmlns:cx4="http://schemas.microsoft.com/office/drawing/2016/5/10/chartex" xmlns:cx5="http://schemas.microsoft.com/office/drawing/2016/5/11/chartex" xmlns:cx6="http://schemas.microsoft.com/office/drawing/2016/5/12/chartex" xmlns:cx7="http://schemas.microsoft.com/office/drawing/2016/5/13/chartex" xmlns:cx8="http://schemas.microsoft.com/office/drawing/2016/5/14/chartex" xmlns:mc="http://schemas.openxmlformats.org/markup-compatibility/2006" xmlns:m="http://schemas.openxmlformats.org/officeDocument/2006/math" xmlns:aink="http://schemas.microsoft.com/office/drawing/2016/ink" xmlns:am3d="http://schemas.microsoft.com/office/drawing/2017/model3d" xmlns:oel="http://schemas.microsoft.com/office/2019/extlst" xmlns:r="http://schemas.openxmlformats.org/officeDocument/2006/relationships" xmlns:wp14="http://schemas.microsoft.com/office/word/2010/wordprocessingDrawing" xmlns:wp="http://schemas.openxmlformats.org/drawingml/2006/wordprocessingDrawing" xmlns:wpg="http://schemas.microsoft.com/office/word/2010/wordprocessingGroup" xmlns:wpi="http://schemas.microsoft.com/office/word/2010/wordprocessingInk" xmlns:wps="http://schemas.microsoft.com/office/word/2010/wordprocessingShape" xmlns:o="urn:schemas-microsoft-com:office:office" xmlns:v="urn:schemas-microsoft-com:vml" xmlns:w10="urn:schemas-microsoft-com:office:word" xmlns:w="http://schemas.openxmlformats.org/wordprocessingml/2006/main" xmlns:w14="http://schemas.microsoft.com/office/word/2010/wordml" xmlns:w15="http://schemas.microsoft.com/office/word/2012/wordml" xmlns:w16cex="http://schemas.microsoft.com/office/word/2018/wordml/cex" xmlns:w16cid="http://schemas.microsoft.com/office/word/2016/wordml/cid" xmlns:w16="http://schemas.microsoft.com/office/word/2018/wordml" xmlns:w16sdtdh="http://schemas.microsoft.com/office/word/2020/wordml/sdtdatahash" xmlns:w16sdtfl="http://schemas.microsoft.com/office/word/2024/wordml/sdtformatlock" xmlns:w16se="http://schemas.microsoft.com/office/word/2015/wordml/symex" xmlns:w16du="http://schemas.microsoft.com/office/word/2023/wordml/word16du" xmlns:wne="http://schemas.microsoft.com/office/word/2006/wordml" mc:Ignorable="w14 w15 w16se w16cid w16 w16cex w16sdtdh w16sdtfl w16du wp14">
+<w:numbering xmlns:wpc="http://schemas.microsoft.com/office/word/2010/wordprocessingCanvas" xmlns:cx="http://schemas.microsoft.com/office/drawing/2014/chartex" xmlns:cx1="http://schemas.microsoft.com/office/drawing/2015/9/8/chartex" xmlns:cx2="http://schemas.microsoft.com/office/drawing/2015/10/21/chartex" xmlns:cx3="http://schemas.microsoft.com/office/drawing/2016/5/9/chartex" xmlns:cx4="http://schemas.microsoft.com/office/drawing/2016/5/10/chartex" xmlns:cx5="http://schemas.microsoft.com/office/drawing/2016/5/11/chartex" xmlns:cx6="http://schemas.microsoft.com/office/drawing/2016/5/12/chartex" xmlns:cx7="http://schemas.microsoft.com/office/drawing/2016/5/13/chartex" xmlns:cx8="http://schemas.microsoft.com/office/drawing/2016/5/14/chartex" xmlns:mc="http://schemas.openxmlformats.org/markup-compatibility/2006" xmlns:aink="http://schemas.microsoft.com/office/drawing/2016/ink" xmlns:am3d="http://schemas.microsoft.com/office/drawing/2017/model3d" xmlns:o="urn:schemas-microsoft-com:office:office" xmlns:oel="http://schemas.microsoft.com/office/2019/extlst" xmlns:r="http://schemas.openxmlformats.org/officeDocument/2006/relationships" xmlns:m="http://schemas.openxmlformats.org/officeDocument/2006/math" xmlns:v="urn:schemas-microsoft-com:vml" xmlns:wp14="http://schemas.microsoft.com/office/word/2010/wordprocessingDrawing" xmlns:wp="http://schemas.openxmlformats.org/drawingml/2006/wordprocessingDrawing" xmlns:w10="urn:schemas-microsoft-com:office:word" xmlns:w="http://schemas.openxmlformats.org/wordprocessingml/2006/main" xmlns:w14="http://schemas.microsoft.com/office/word/2010/wordml" xmlns:w15="http://schemas.microsoft.com/office/word/2012/wordml" xmlns:w16cex="http://schemas.microsoft.com/office/word/2018/wordml/cex" xmlns:w16cid="http://schemas.microsoft.com/office/word/2016/wordml/cid" xmlns:w16="http://schemas.microsoft.com/office/word/2018/wordml" xmlns:w16du="http://schemas.microsoft.com/office/word/2023/wordml/word16du" xmlns:w16sdtdh="http://schemas.microsoft.com/office/word/2020/wordml/sdtdatahash" xmlns:w16sdtfl="http://schemas.microsoft.com/office/word/2024/wordml/sdtformatlock" xmlns:w16se="http://schemas.microsoft.com/office/word/2015/wordml/symex" xmlns:wpg="http://schemas.microsoft.com/office/word/2010/wordprocessingGroup" xmlns:wpi="http://schemas.microsoft.com/office/word/2010/wordprocessingInk" xmlns:wne="http://schemas.microsoft.com/office/word/2006/wordml" xmlns:wps="http://schemas.microsoft.com/office/word/2010/wordprocessingShape" mc:Ignorable="w14 w15 w16se w16cid w16 w16cex w16sdtdh w16sdtfl w16du wp14">
   <w:abstractNum w:abstractNumId="0" w15:restartNumberingAfterBreak="0">
     <w:nsid w:val="70A82457"/>
     <w:multiLevelType w:val="multilevel"/>
@@ -4223,7 +4714,7 @@
 </file>
 
 <file path=word/styles.xml><?xml version="1.0" encoding="utf-8"?>
-<w:styles xmlns:mc="http://schemas.openxmlformats.org/markup-compatibility/2006" xmlns:r="http://schemas.openxmlformats.org/officeDocument/2006/relationships" xmlns:w="http://schemas.openxmlformats.org/wordprocessingml/2006/main" xmlns:w14="http://schemas.microsoft.com/office/word/2010/wordml" xmlns:w15="http://schemas.microsoft.com/office/word/2012/wordml" xmlns:w16cex="http://schemas.microsoft.com/office/word/2018/wordml/cex" xmlns:w16cid="http://schemas.microsoft.com/office/word/2016/wordml/cid" xmlns:w16="http://schemas.microsoft.com/office/word/2018/wordml" xmlns:w16sdtdh="http://schemas.microsoft.com/office/word/2020/wordml/sdtdatahash" xmlns:w16sdtfl="http://schemas.microsoft.com/office/word/2024/wordml/sdtformatlock" xmlns:w16se="http://schemas.microsoft.com/office/word/2015/wordml/symex" xmlns:w16du="http://schemas.microsoft.com/office/word/2023/wordml/word16du" mc:Ignorable="w14 w15 w16se w16cid w16 w16cex w16sdtdh w16sdtfl w16du">
+<w:styles xmlns:mc="http://schemas.openxmlformats.org/markup-compatibility/2006" xmlns:r="http://schemas.openxmlformats.org/officeDocument/2006/relationships" xmlns:w="http://schemas.openxmlformats.org/wordprocessingml/2006/main" xmlns:w14="http://schemas.microsoft.com/office/word/2010/wordml" xmlns:w15="http://schemas.microsoft.com/office/word/2012/wordml" xmlns:w16cex="http://schemas.microsoft.com/office/word/2018/wordml/cex" xmlns:w16cid="http://schemas.microsoft.com/office/word/2016/wordml/cid" xmlns:w16="http://schemas.microsoft.com/office/word/2018/wordml" xmlns:w16du="http://schemas.microsoft.com/office/word/2023/wordml/word16du" xmlns:w16sdtdh="http://schemas.microsoft.com/office/word/2020/wordml/sdtdatahash" xmlns:w16sdtfl="http://schemas.microsoft.com/office/word/2024/wordml/sdtformatlock" xmlns:w16se="http://schemas.microsoft.com/office/word/2015/wordml/symex" mc:Ignorable="w14 w15 w16se w16cid w16 w16cex w16sdtdh w16sdtfl w16du">
   <w:docDefaults>
     <w:rPrDefault>
       <w:rPr>
@@ -4868,7 +5359,6 @@
   <w:style w:type="character" w:default="1" w:styleId="DefaultParagraphFont">
     <w:name w:val="Default Paragraph Font"/>
     <w:uiPriority w:val="1"/>
-    <w:semiHidden/>
     <w:unhideWhenUsed/>
   </w:style>
   <w:style w:type="table" w:default="1" w:styleId="TableNormal">

</xml_diff>